<commit_message>
feat: tich hop Che do Kiem tra tinh diem, cham diem thang 10 va Bang diem Giao vien vao Website on tap Tin hoc GK1
</commit_message>
<xml_diff>
--- a/Hệ thống mẫu văn bản/Nguyên đã làm/Lịch báo giảng/Lịch báo giảng - Tuần 01 (THCS).docx
+++ b/Hệ thống mẫu văn bản/Nguyên đã làm/Lịch báo giảng/Lịch báo giảng - Tuần 01 (THCS).docx
@@ -10,6 +10,10 @@
         </w:rPr>
       </w:pPr>
       <w:r>
+        <w:rPr>
+          <w:rFonts w:ascii="Times New Roman" w:hAnsi="Times New Roman"/>
+          <w:sz w:val="26"/>
+        </w:rPr>
         <w:t>TUẦN 01 (từ ngày 03/08/2026 đến ngày 07/08/2026)</w:t>
       </w:r>
     </w:p>
@@ -22,6 +26,10 @@
         </w:rPr>
       </w:pPr>
       <w:r>
+        <w:rPr>
+          <w:rFonts w:ascii="Times New Roman" w:hAnsi="Times New Roman"/>
+          <w:sz w:val="26"/>
+        </w:rPr>
         <w:t>Ngày 31 tháng 07 năm 2026</w:t>
       </w:r>
     </w:p>
@@ -34,9 +42,11 @@
       </w:pPr>
       <w:r>
         <w:rPr>
+          <w:rFonts w:ascii="Times New Roman" w:hAnsi="Times New Roman"/>
           <w:i/>
+          <w:sz w:val="26"/>
         </w:rPr>
-        <w:t>Buổi…sáng……..Tuần…01…(Từ ngày…03/08/2026 …đến ngày:… 07/08/2026….)</w:t>
+        <w:t>Buổi sáng    Tuần 01 (Từ ngày 03/08/2026 đến ngày 07/08/2026)</w:t>
       </w:r>
     </w:p>
     <w:tbl>
@@ -5212,149 +5222,8 @@
     </w:tbl>
     <w:p>
       <w:pPr>
-        <w:spacing w:after="0" w:line="240" w:lineRule="auto"/>
-        <w:jc w:val="center"/>
-        <w:rPr>
-          <w:i/>
-        </w:rPr>
+        <w:spacing w:before="0" w:after="0"/>
       </w:pPr>
-      <w:r>
-        <w:rPr>
-          <w:i/>
-        </w:rPr>
-        <w:t xml:space="preserve"> </w:t>
-      </w:r>
-    </w:p>
-    <w:p>
-      <w:pPr>
-        <w:spacing w:after="0" w:line="240" w:lineRule="auto"/>
-        <w:jc w:val="center"/>
-        <w:rPr>
-          <w:i/>
-        </w:rPr>
-      </w:pPr>
-    </w:p>
-    <w:tbl>
-      <w:tblPr>
-        <w:tblStyle w:val="TableGrid"/>
-        <w:tblW w:w="0" w:type="auto"/>
-        <w:tblBorders>
-          <w:top w:val="none" w:sz="0" w:space="0" w:color="auto"/>
-          <w:left w:val="none" w:sz="0" w:space="0" w:color="auto"/>
-          <w:bottom w:val="none" w:sz="0" w:space="0" w:color="auto"/>
-          <w:right w:val="none" w:sz="0" w:space="0" w:color="auto"/>
-          <w:insideH w:val="none" w:sz="0" w:space="0" w:color="auto"/>
-          <w:insideV w:val="none" w:sz="0" w:space="0" w:color="auto"/>
-        </w:tblBorders>
-        <w:tblLook w:val="04A0" w:firstRow="1" w:lastRow="0" w:firstColumn="1" w:lastColumn="0" w:noHBand="0" w:noVBand="1"/>
-      </w:tblPr>
-      <w:tblGrid>
-        <w:gridCol w:w="6716"/>
-        <w:gridCol w:w="3294"/>
-      </w:tblGrid>
-      <w:tr>
-        <w:tc>
-          <w:tcPr>
-            <w:tcW w:w="6091" w:type="dxa"/>
-          </w:tcPr>
-          <w:p>
-            <w:pPr>
-              <w:rPr>
-                <w:rFonts w:ascii="Times New Roman" w:hAnsi="Times New Roman" w:cs="Times New Roman"/>
-                <w:sz w:val="26"/>
-                <w:szCs w:val="26"/>
-              </w:rPr>
-            </w:pPr>
-            <w:r>
-              <w:rPr>
-                <w:rFonts w:ascii="Times New Roman" w:hAnsi="Times New Roman" w:cs="Times New Roman"/>
-                <w:sz w:val="26"/>
-                <w:szCs w:val="26"/>
-              </w:rPr>
-              <w:t>Kiểm tra, nhận xét</w:t>
-            </w:r>
-            <w:r>
-              <w:rPr>
-                <w:rFonts w:ascii="Times New Roman" w:hAnsi="Times New Roman" w:cs="Times New Roman"/>
-                <w:sz w:val="26"/>
-                <w:szCs w:val="26"/>
-              </w:rPr>
-              <w:br/>
-              <w:t>…………………………………………………………………</w:t>
-            </w:r>
-            <w:r>
-              <w:rPr>
-                <w:rFonts w:ascii="Times New Roman" w:hAnsi="Times New Roman" w:cs="Times New Roman"/>
-                <w:sz w:val="26"/>
-                <w:szCs w:val="26"/>
-              </w:rPr>
-              <w:br/>
-              <w:t>…………………………………………………………………</w:t>
-            </w:r>
-            <w:r>
-              <w:rPr>
-                <w:rFonts w:ascii="Times New Roman" w:hAnsi="Times New Roman" w:cs="Times New Roman"/>
-                <w:sz w:val="26"/>
-                <w:szCs w:val="26"/>
-              </w:rPr>
-              <w:br/>
-              <w:t>…………………………………………………………………</w:t>
-            </w:r>
-            <w:r>
-              <w:rPr>
-                <w:rFonts w:ascii="Times New Roman" w:hAnsi="Times New Roman" w:cs="Times New Roman"/>
-                <w:sz w:val="26"/>
-                <w:szCs w:val="26"/>
-              </w:rPr>
-              <w:br/>
-              <w:t>…………………………………………………………………</w:t>
-            </w:r>
-          </w:p>
-        </w:tc>
-        <w:tc>
-          <w:tcPr>
-            <w:tcW w:w="3909" w:type="dxa"/>
-          </w:tcPr>
-          <w:p>
-            <w:pPr>
-              <w:jc w:val="center"/>
-              <w:rPr>
-                <w:rFonts w:ascii="Times New Roman" w:hAnsi="Times New Roman" w:cs="Times New Roman"/>
-                <w:sz w:val="26"/>
-                <w:szCs w:val="26"/>
-              </w:rPr>
-            </w:pPr>
-            <w:r>
-              <w:rPr>
-                <w:rFonts w:ascii="Times New Roman" w:hAnsi="Times New Roman"/>
-                <w:sz w:val="26"/>
-              </w:rPr>
-              <w:t>Ngày 31 tháng 7 năm 2026</w:t>
-              <w:br/>
-            </w:r>
-            <w:r>
-              <w:rPr>
-                <w:rFonts w:ascii="Times New Roman" w:hAnsi="Times New Roman"/>
-                <w:sz w:val="26"/>
-              </w:rPr>
-              <w:t>Tổ trưởng</w:t>
-              <w:br/>
-              <w:br/>
-              <w:br/>
-              <w:br/>
-            </w:r>
-            <w:r>
-              <w:rPr>
-                <w:rFonts w:ascii="Times New Roman" w:hAnsi="Times New Roman"/>
-                <w:sz w:val="26"/>
-              </w:rPr>
-              <w:t>Nguyễn Thị Ngọc Ánh</w:t>
-            </w:r>
-          </w:p>
-        </w:tc>
-      </w:tr>
-    </w:tbl>
-    <w:p>
       <w:r>
         <w:br w:type="page"/>
       </w:r>
@@ -5368,9 +5237,11 @@
       </w:pPr>
       <w:r>
         <w:rPr>
+          <w:rFonts w:ascii="Times New Roman" w:hAnsi="Times New Roman"/>
           <w:i/>
+          <w:sz w:val="26"/>
         </w:rPr>
-        <w:t>Buổi…chiều…..Tuần…01…(Từ ngày…03/08/2026…đến ngày:… 07/08/2026….)</w:t>
+        <w:t>Buổi chiều    Tuần 01 (Từ ngày 03/08/2026 đến ngày 07/08/2026)</w:t>
       </w:r>
     </w:p>
     <w:tbl>

</xml_diff>